<commit_message>
feat(corpus): update legal sources in data/raw
Add Decreto Ley 1295/1994, Ley 776/2002, Ley 2209/2022, Res. 1843/2025
and Res. 3461/2025; remove Res. 2346/2007, derogated by Res. 1843/2025;
mark the original art. 18 of Ley 1010/2006 as derogated by Ley 2209/2022.
</commit_message>
<xml_diff>
--- a/data/raw/Ley 1010 de 2006.docx
+++ b/data/raw/Ley 1010 de 2006.docx
@@ -8608,7 +8608,7 @@
           <w:szCs w:val="22"/>
           <w:lang w:val="es"/>
         </w:rPr>
-        <w:t>El texto original era el siguiente:</w:t>
+        <w:t>Texto original DEROGADO (no vigente), reemplazado por el art. 1 de la Ley 2209 de 2022:</w:t>
       </w:r>
     </w:p>
     <w:p xmlns:wp14="http://schemas.microsoft.com/office/word/2010/wordml" wp14:paraId="780D3DCB" wp14:textId="3C636FD2">
@@ -8632,7 +8632,7 @@
           <w:szCs w:val="22"/>
           <w:lang w:val="es-ES"/>
         </w:rPr>
-        <w:t>Artículo 18. Caducidad. Las acciones derivadas del acoso laboral caducarán seis (6) meses después de la fecha en que hayan ocurrido las conductas a que hace referencia esta ley.</w:t>
+        <w:t>(DEROGADO) Artículo 18. Caducidad. Las acciones derivadas del acoso laboral caducarán seis (6) meses después de la fecha en que hayan ocurrido las conductas a que hace referencia esta ley.</w:t>
       </w:r>
     </w:p>
     <w:p xmlns:wp14="http://schemas.microsoft.com/office/word/2010/wordml" wp14:paraId="3EA7140B" wp14:textId="31176F3D">

</xml_diff>